<commit_message>
Improve launch archive and member access flows
</commit_message>
<xml_diff>
--- a/content/member-assets/manual-workflow-concierge/workflow-concierge-template.docx
+++ b/content/member-assets/manual-workflow-concierge/workflow-concierge-template.docx
@@ -7,7 +7,7 @@
         <w:pStyle w:val="BrandBand"/>
       </w:pPr>
       <w:r>
-        <w:t xml:space="preserve">SIDE HUSTLE STEPHEN - THE LAUNCHPAD</w:t>
+        <w:t xml:space="preserve">SIDE HUSTLE STEPHEN</w:t>
       </w:r>
     </w:p>
     <w:p>
@@ -50,22 +50,243 @@
         <w:spacing w:before="70" w:after="210"/>
       </w:pPr>
     </w:p>
-    <w:p>
-      <w:pPr>
-        <w:pStyle w:val="Meta"/>
-      </w:pPr>
-      <w:r>
-        <w:t xml:space="preserve">Buyer: Niche B2B operators</w:t>
-      </w:r>
-    </w:p>
-    <w:p>
-      <w:pPr>
-        <w:pStyle w:val="Meta"/>
-      </w:pPr>
-      <w:r>
-        <w:t xml:space="preserve">Category: AI Tool  /  Startup cost: $0  /  First sale: 2-4 weeks  /  Difficulty: Hard</w:t>
-      </w:r>
-    </w:p>
+    <w:tbl>
+      <w:tblPr>
+        <w:tblW w:w="0" w:type="auto"/>
+        <w:tblInd w:w="0" w:type="dxa"/>
+        <w:tblBorders>
+          <w:top w:val="single" w:sz="6" w:color="E0DFDD"/>
+          <w:left w:val="single" w:sz="6" w:color="E0DFDD"/>
+          <w:bottom w:val="single" w:sz="6" w:color="E0DFDD"/>
+          <w:right w:val="single" w:sz="6" w:color="E0DFDD"/>
+          <w:insideH w:val="single" w:sz="4" w:color="E0DFDD"/>
+          <w:insideV w:val="single" w:sz="4" w:color="E0DFDD"/>
+        </w:tblBorders>
+        <w:tblLook w:firstRow="1" w:noHBand="0" w:noVBand="1"/>
+      </w:tblPr>
+      <w:tblGrid>
+        <w:gridCol w:w="2200"/>
+        <w:gridCol w:w="6980"/>
+      </w:tblGrid>
+      <w:tr>
+        <w:tc>
+          <w:tcPr>
+            <w:tcW w:w="2200" w:type="dxa"/>
+            <w:shd w:fill="F5F3F1"/>
+            <w:tcMar>
+              <w:top w:w="120" w:type="dxa"/>
+              <w:left w:w="150" w:type="dxa"/>
+              <w:bottom w:w="120" w:type="dxa"/>
+              <w:right w:w="150" w:type="dxa"/>
+            </w:tcMar>
+            <w:vAlign w:val="center"/>
+          </w:tcPr>
+          <w:p>
+            <w:pPr>
+              <w:pStyle w:val="TableLabel"/>
+            </w:pPr>
+            <w:r>
+              <w:t xml:space="preserve">Buyer</w:t>
+            </w:r>
+          </w:p>
+        </w:tc>
+        <w:tc>
+          <w:tcPr>
+            <w:tcW w:w="6980" w:type="dxa"/>
+            <w:shd w:fill="F5F3F1"/>
+            <w:tcMar>
+              <w:top w:w="120" w:type="dxa"/>
+              <w:left w:w="150" w:type="dxa"/>
+              <w:bottom w:w="120" w:type="dxa"/>
+              <w:right w:w="150" w:type="dxa"/>
+            </w:tcMar>
+            <w:vAlign w:val="center"/>
+          </w:tcPr>
+          <w:p>
+            <w:pPr>
+              <w:pStyle w:val="TableCell"/>
+            </w:pPr>
+            <w:r>
+              <w:t xml:space="preserve">Niche B2B operators</w:t>
+            </w:r>
+          </w:p>
+        </w:tc>
+      </w:tr>
+      <w:tr>
+        <w:tc>
+          <w:tcPr>
+            <w:tcW w:w="2200" w:type="dxa"/>
+            <w:shd w:fill="F5F3F1"/>
+            <w:tcMar>
+              <w:top w:w="120" w:type="dxa"/>
+              <w:left w:w="150" w:type="dxa"/>
+              <w:bottom w:w="120" w:type="dxa"/>
+              <w:right w:w="150" w:type="dxa"/>
+            </w:tcMar>
+            <w:vAlign w:val="center"/>
+          </w:tcPr>
+          <w:p>
+            <w:pPr>
+              <w:pStyle w:val="TableLabel"/>
+            </w:pPr>
+            <w:r>
+              <w:t xml:space="preserve">Category</w:t>
+            </w:r>
+          </w:p>
+        </w:tc>
+        <w:tc>
+          <w:tcPr>
+            <w:tcW w:w="6980" w:type="dxa"/>
+            <w:tcMar>
+              <w:top w:w="120" w:type="dxa"/>
+              <w:left w:w="150" w:type="dxa"/>
+              <w:bottom w:w="120" w:type="dxa"/>
+              <w:right w:w="150" w:type="dxa"/>
+            </w:tcMar>
+            <w:vAlign w:val="center"/>
+          </w:tcPr>
+          <w:p>
+            <w:pPr>
+              <w:pStyle w:val="TableCell"/>
+            </w:pPr>
+            <w:r>
+              <w:t xml:space="preserve">AI Tool</w:t>
+            </w:r>
+          </w:p>
+        </w:tc>
+      </w:tr>
+      <w:tr>
+        <w:tc>
+          <w:tcPr>
+            <w:tcW w:w="2200" w:type="dxa"/>
+            <w:shd w:fill="F5F3F1"/>
+            <w:tcMar>
+              <w:top w:w="120" w:type="dxa"/>
+              <w:left w:w="150" w:type="dxa"/>
+              <w:bottom w:w="120" w:type="dxa"/>
+              <w:right w:w="150" w:type="dxa"/>
+            </w:tcMar>
+            <w:vAlign w:val="center"/>
+          </w:tcPr>
+          <w:p>
+            <w:pPr>
+              <w:pStyle w:val="TableLabel"/>
+            </w:pPr>
+            <w:r>
+              <w:t xml:space="preserve">Startup cost</w:t>
+            </w:r>
+          </w:p>
+        </w:tc>
+        <w:tc>
+          <w:tcPr>
+            <w:tcW w:w="6980" w:type="dxa"/>
+            <w:shd w:fill="F5F3F1"/>
+            <w:tcMar>
+              <w:top w:w="120" w:type="dxa"/>
+              <w:left w:w="150" w:type="dxa"/>
+              <w:bottom w:w="120" w:type="dxa"/>
+              <w:right w:w="150" w:type="dxa"/>
+            </w:tcMar>
+            <w:vAlign w:val="center"/>
+          </w:tcPr>
+          <w:p>
+            <w:pPr>
+              <w:pStyle w:val="TableCell"/>
+            </w:pPr>
+            <w:r>
+              <w:t xml:space="preserve">$0</w:t>
+            </w:r>
+          </w:p>
+        </w:tc>
+      </w:tr>
+      <w:tr>
+        <w:tc>
+          <w:tcPr>
+            <w:tcW w:w="2200" w:type="dxa"/>
+            <w:shd w:fill="F5F3F1"/>
+            <w:tcMar>
+              <w:top w:w="120" w:type="dxa"/>
+              <w:left w:w="150" w:type="dxa"/>
+              <w:bottom w:w="120" w:type="dxa"/>
+              <w:right w:w="150" w:type="dxa"/>
+            </w:tcMar>
+            <w:vAlign w:val="center"/>
+          </w:tcPr>
+          <w:p>
+            <w:pPr>
+              <w:pStyle w:val="TableLabel"/>
+            </w:pPr>
+            <w:r>
+              <w:t xml:space="preserve">First sale</w:t>
+            </w:r>
+          </w:p>
+        </w:tc>
+        <w:tc>
+          <w:tcPr>
+            <w:tcW w:w="6980" w:type="dxa"/>
+            <w:tcMar>
+              <w:top w:w="120" w:type="dxa"/>
+              <w:left w:w="150" w:type="dxa"/>
+              <w:bottom w:w="120" w:type="dxa"/>
+              <w:right w:w="150" w:type="dxa"/>
+            </w:tcMar>
+            <w:vAlign w:val="center"/>
+          </w:tcPr>
+          <w:p>
+            <w:pPr>
+              <w:pStyle w:val="TableCell"/>
+            </w:pPr>
+            <w:r>
+              <w:t xml:space="preserve">2-4 weeks</w:t>
+            </w:r>
+          </w:p>
+        </w:tc>
+      </w:tr>
+      <w:tr>
+        <w:tc>
+          <w:tcPr>
+            <w:tcW w:w="2200" w:type="dxa"/>
+            <w:shd w:fill="F5F3F1"/>
+            <w:tcMar>
+              <w:top w:w="120" w:type="dxa"/>
+              <w:left w:w="150" w:type="dxa"/>
+              <w:bottom w:w="120" w:type="dxa"/>
+              <w:right w:w="150" w:type="dxa"/>
+            </w:tcMar>
+            <w:vAlign w:val="center"/>
+          </w:tcPr>
+          <w:p>
+            <w:pPr>
+              <w:pStyle w:val="TableLabel"/>
+            </w:pPr>
+            <w:r>
+              <w:t xml:space="preserve">Difficulty</w:t>
+            </w:r>
+          </w:p>
+        </w:tc>
+        <w:tc>
+          <w:tcPr>
+            <w:tcW w:w="6980" w:type="dxa"/>
+            <w:shd w:fill="F5F3F1"/>
+            <w:tcMar>
+              <w:top w:w="120" w:type="dxa"/>
+              <w:left w:w="150" w:type="dxa"/>
+              <w:bottom w:w="120" w:type="dxa"/>
+              <w:right w:w="150" w:type="dxa"/>
+            </w:tcMar>
+            <w:vAlign w:val="center"/>
+          </w:tcPr>
+          <w:p>
+            <w:pPr>
+              <w:pStyle w:val="TableCell"/>
+            </w:pPr>
+            <w:r>
+              <w:t xml:space="preserve">Hard</w:t>
+            </w:r>
+          </w:p>
+        </w:tc>
+      </w:tr>
+    </w:tbl>
     <w:p>
       <w:pPr>
         <w:pStyle w:val="Kicker"/>
@@ -87,36 +308,807 @@
         <w:pStyle w:val="Kicker"/>
       </w:pPr>
       <w:r>
-        <w:t>IN THIS DOCUMENT</w:t>
-      </w:r>
-    </w:p>
-    <w:p>
-      <w:pPr>
-        <w:rPr>
-          <w:color w:val="57534E"/>
-          <w:sz w:val="18"/>
-        </w:rPr>
-      </w:pPr>
-      <w:r>
-        <w:fldChar w:fldCharType="begin"/>
-      </w:r>
-      <w:r>
-        <w:instrText xml:space="preserve"> TOC \o "1-1" \h \z \u </w:instrText>
-      </w:r>
-      <w:r>
-        <w:fldChar w:fldCharType="separate"/>
-      </w:r>
-      <w:r>
-        <w:rPr>
-          <w:color w:val="57534E"/>
-          <w:sz w:val="18"/>
-        </w:rPr>
-        <w:t xml:space="preserve">Right-click and choose Update Field to build the contents.</w:t>
-      </w:r>
-      <w:r>
-        <w:fldChar w:fldCharType="end"/>
-      </w:r>
-    </w:p>
+        <w:t xml:space="preserve">Launch action board</w:t>
+      </w:r>
+    </w:p>
+    <w:tbl>
+      <w:tblPr>
+        <w:tblW w:w="0" w:type="auto"/>
+        <w:tblInd w:w="0" w:type="dxa"/>
+        <w:tblBorders>
+          <w:top w:val="single" w:sz="6" w:color="E0DFDD"/>
+          <w:left w:val="single" w:sz="6" w:color="E0DFDD"/>
+          <w:bottom w:val="single" w:sz="6" w:color="E0DFDD"/>
+          <w:right w:val="single" w:sz="6" w:color="E0DFDD"/>
+          <w:insideH w:val="single" w:sz="4" w:color="E0DFDD"/>
+          <w:insideV w:val="single" w:sz="4" w:color="E0DFDD"/>
+        </w:tblBorders>
+        <w:tblLook w:firstRow="1" w:noHBand="0" w:noVBand="1"/>
+      </w:tblPr>
+      <w:tblGrid>
+        <w:gridCol w:w="1620"/>
+        <w:gridCol w:w="3960"/>
+        <w:gridCol w:w="3600"/>
+      </w:tblGrid>
+      <w:tr>
+        <w:tc>
+          <w:tcPr>
+            <w:tcW w:w="1620" w:type="dxa"/>
+            <w:shd w:fill="0A0A0A"/>
+            <w:tcMar>
+              <w:top w:w="120" w:type="dxa"/>
+              <w:left w:w="150" w:type="dxa"/>
+              <w:bottom w:w="120" w:type="dxa"/>
+              <w:right w:w="150" w:type="dxa"/>
+            </w:tcMar>
+            <w:vAlign w:val="center"/>
+          </w:tcPr>
+          <w:p>
+            <w:pPr>
+              <w:pStyle w:val="TableHeader"/>
+            </w:pPr>
+            <w:r>
+              <w:t xml:space="preserve">Move</w:t>
+            </w:r>
+          </w:p>
+        </w:tc>
+        <w:tc>
+          <w:tcPr>
+            <w:tcW w:w="3960" w:type="dxa"/>
+            <w:shd w:fill="0A0A0A"/>
+            <w:tcMar>
+              <w:top w:w="120" w:type="dxa"/>
+              <w:left w:w="150" w:type="dxa"/>
+              <w:bottom w:w="120" w:type="dxa"/>
+              <w:right w:w="150" w:type="dxa"/>
+            </w:tcMar>
+            <w:vAlign w:val="center"/>
+          </w:tcPr>
+          <w:p>
+            <w:pPr>
+              <w:pStyle w:val="TableHeader"/>
+            </w:pPr>
+            <w:r>
+              <w:t xml:space="preserve">What to check</w:t>
+            </w:r>
+          </w:p>
+        </w:tc>
+        <w:tc>
+          <w:tcPr>
+            <w:tcW w:w="3600" w:type="dxa"/>
+            <w:shd w:fill="0A0A0A"/>
+            <w:tcMar>
+              <w:top w:w="120" w:type="dxa"/>
+              <w:left w:w="150" w:type="dxa"/>
+              <w:bottom w:w="120" w:type="dxa"/>
+              <w:right w:w="150" w:type="dxa"/>
+            </w:tcMar>
+            <w:vAlign w:val="center"/>
+          </w:tcPr>
+          <w:p>
+            <w:pPr>
+              <w:pStyle w:val="TableHeader"/>
+            </w:pPr>
+            <w:r>
+              <w:t xml:space="preserve">Output</w:t>
+            </w:r>
+          </w:p>
+        </w:tc>
+      </w:tr>
+      <w:tr>
+        <w:tc>
+          <w:tcPr>
+            <w:tcW w:w="1620" w:type="dxa"/>
+            <w:shd w:fill="F5F3F1"/>
+            <w:tcMar>
+              <w:top w:w="120" w:type="dxa"/>
+              <w:left w:w="150" w:type="dxa"/>
+              <w:bottom w:w="120" w:type="dxa"/>
+              <w:right w:w="150" w:type="dxa"/>
+            </w:tcMar>
+            <w:vAlign w:val="center"/>
+          </w:tcPr>
+          <w:p>
+            <w:pPr>
+              <w:pStyle w:val="TableCell"/>
+            </w:pPr>
+            <w:r>
+              <w:t xml:space="preserve">1. Scope</w:t>
+            </w:r>
+          </w:p>
+        </w:tc>
+        <w:tc>
+          <w:tcPr>
+            <w:tcW w:w="3960" w:type="dxa"/>
+            <w:shd w:fill="F5F3F1"/>
+            <w:tcMar>
+              <w:top w:w="120" w:type="dxa"/>
+              <w:left w:w="150" w:type="dxa"/>
+              <w:bottom w:w="120" w:type="dxa"/>
+              <w:right w:w="150" w:type="dxa"/>
+            </w:tcMar>
+            <w:vAlign w:val="center"/>
+          </w:tcPr>
+          <w:p>
+            <w:pPr>
+              <w:pStyle w:val="TableCell"/>
+            </w:pPr>
+            <w:r>
+              <w:t xml:space="preserve">Buyer, input files, sensitive claims, approval owner</w:t>
+            </w:r>
+          </w:p>
+        </w:tc>
+        <w:tc>
+          <w:tcPr>
+            <w:tcW w:w="3600" w:type="dxa"/>
+            <w:shd w:fill="F5F3F1"/>
+            <w:tcMar>
+              <w:top w:w="120" w:type="dxa"/>
+              <w:left w:w="150" w:type="dxa"/>
+              <w:bottom w:w="120" w:type="dxa"/>
+              <w:right w:w="150" w:type="dxa"/>
+            </w:tcMar>
+            <w:vAlign w:val="center"/>
+          </w:tcPr>
+          <w:p>
+            <w:pPr>
+              <w:pStyle w:val="TableCell"/>
+            </w:pPr>
+            <w:r>
+              <w:t xml:space="preserve">Clean project brief</w:t>
+            </w:r>
+          </w:p>
+        </w:tc>
+      </w:tr>
+      <w:tr>
+        <w:tc>
+          <w:tcPr>
+            <w:tcW w:w="1620" w:type="dxa"/>
+            <w:tcMar>
+              <w:top w:w="120" w:type="dxa"/>
+              <w:left w:w="150" w:type="dxa"/>
+              <w:bottom w:w="120" w:type="dxa"/>
+              <w:right w:w="150" w:type="dxa"/>
+            </w:tcMar>
+            <w:vAlign w:val="center"/>
+          </w:tcPr>
+          <w:p>
+            <w:pPr>
+              <w:pStyle w:val="TableCell"/>
+            </w:pPr>
+            <w:r>
+              <w:t xml:space="preserve">2. Build</w:t>
+            </w:r>
+          </w:p>
+        </w:tc>
+        <w:tc>
+          <w:tcPr>
+            <w:tcW w:w="3960" w:type="dxa"/>
+            <w:tcMar>
+              <w:top w:w="120" w:type="dxa"/>
+              <w:left w:w="150" w:type="dxa"/>
+              <w:bottom w:w="120" w:type="dxa"/>
+              <w:right w:w="150" w:type="dxa"/>
+            </w:tcMar>
+            <w:vAlign w:val="center"/>
+          </w:tcPr>
+          <w:p>
+            <w:pPr>
+              <w:pStyle w:val="TableCell"/>
+            </w:pPr>
+            <w:r>
+              <w:t xml:space="preserve">Use the template, prompts, checklist, or workbook sections</w:t>
+            </w:r>
+          </w:p>
+        </w:tc>
+        <w:tc>
+          <w:tcPr>
+            <w:tcW w:w="3600" w:type="dxa"/>
+            <w:tcMar>
+              <w:top w:w="120" w:type="dxa"/>
+              <w:left w:w="150" w:type="dxa"/>
+              <w:bottom w:w="120" w:type="dxa"/>
+              <w:right w:w="150" w:type="dxa"/>
+            </w:tcMar>
+            <w:vAlign w:val="center"/>
+          </w:tcPr>
+          <w:p>
+            <w:pPr>
+              <w:pStyle w:val="TableCell"/>
+            </w:pPr>
+            <w:r>
+              <w:t xml:space="preserve">Buyer-specific asset</w:t>
+            </w:r>
+          </w:p>
+        </w:tc>
+      </w:tr>
+      <w:tr>
+        <w:tc>
+          <w:tcPr>
+            <w:tcW w:w="1620" w:type="dxa"/>
+            <w:shd w:fill="F5F3F1"/>
+            <w:tcMar>
+              <w:top w:w="120" w:type="dxa"/>
+              <w:left w:w="150" w:type="dxa"/>
+              <w:bottom w:w="120" w:type="dxa"/>
+              <w:right w:w="150" w:type="dxa"/>
+            </w:tcMar>
+            <w:vAlign w:val="center"/>
+          </w:tcPr>
+          <w:p>
+            <w:pPr>
+              <w:pStyle w:val="TableCell"/>
+            </w:pPr>
+            <w:r>
+              <w:t xml:space="preserve">3. Approve</w:t>
+            </w:r>
+          </w:p>
+        </w:tc>
+        <w:tc>
+          <w:tcPr>
+            <w:tcW w:w="3960" w:type="dxa"/>
+            <w:shd w:fill="F5F3F1"/>
+            <w:tcMar>
+              <w:top w:w="120" w:type="dxa"/>
+              <w:left w:w="150" w:type="dxa"/>
+              <w:bottom w:w="120" w:type="dxa"/>
+              <w:right w:w="150" w:type="dxa"/>
+            </w:tcMar>
+            <w:vAlign w:val="center"/>
+          </w:tcPr>
+          <w:p>
+            <w:pPr>
+              <w:pStyle w:val="TableCell"/>
+            </w:pPr>
+            <w:r>
+              <w:t xml:space="preserve">Facts, prices, dates, links, policies, and public claims</w:t>
+            </w:r>
+          </w:p>
+        </w:tc>
+        <w:tc>
+          <w:tcPr>
+            <w:tcW w:w="3600" w:type="dxa"/>
+            <w:shd w:fill="F5F3F1"/>
+            <w:tcMar>
+              <w:top w:w="120" w:type="dxa"/>
+              <w:left w:w="150" w:type="dxa"/>
+              <w:bottom w:w="120" w:type="dxa"/>
+              <w:right w:w="150" w:type="dxa"/>
+            </w:tcMar>
+            <w:vAlign w:val="center"/>
+          </w:tcPr>
+          <w:p>
+            <w:pPr>
+              <w:pStyle w:val="TableCell"/>
+            </w:pPr>
+            <w:r>
+              <w:t xml:space="preserve">Approved final version</w:t>
+            </w:r>
+          </w:p>
+        </w:tc>
+      </w:tr>
+      <w:tr>
+        <w:tc>
+          <w:tcPr>
+            <w:tcW w:w="1620" w:type="dxa"/>
+            <w:tcMar>
+              <w:top w:w="120" w:type="dxa"/>
+              <w:left w:w="150" w:type="dxa"/>
+              <w:bottom w:w="120" w:type="dxa"/>
+              <w:right w:w="150" w:type="dxa"/>
+            </w:tcMar>
+            <w:vAlign w:val="center"/>
+          </w:tcPr>
+          <w:p>
+            <w:pPr>
+              <w:pStyle w:val="TableCell"/>
+            </w:pPr>
+            <w:r>
+              <w:t xml:space="preserve">4. Follow up</w:t>
+            </w:r>
+          </w:p>
+        </w:tc>
+        <w:tc>
+          <w:tcPr>
+            <w:tcW w:w="3960" w:type="dxa"/>
+            <w:tcMar>
+              <w:top w:w="120" w:type="dxa"/>
+              <w:left w:w="150" w:type="dxa"/>
+              <w:bottom w:w="120" w:type="dxa"/>
+              <w:right w:w="150" w:type="dxa"/>
+            </w:tcMar>
+            <w:vAlign w:val="center"/>
+          </w:tcPr>
+          <w:p>
+            <w:pPr>
+              <w:pStyle w:val="TableCell"/>
+            </w:pPr>
+            <w:r>
+              <w:t xml:space="preserve">Next refresh, retainer, or second sprint</w:t>
+            </w:r>
+          </w:p>
+        </w:tc>
+        <w:tc>
+          <w:tcPr>
+            <w:tcW w:w="3600" w:type="dxa"/>
+            <w:tcMar>
+              <w:top w:w="120" w:type="dxa"/>
+              <w:left w:w="150" w:type="dxa"/>
+              <w:bottom w:w="120" w:type="dxa"/>
+              <w:right w:w="150" w:type="dxa"/>
+            </w:tcMar>
+            <w:vAlign w:val="center"/>
+          </w:tcPr>
+          <w:p>
+            <w:pPr>
+              <w:pStyle w:val="TableCell"/>
+            </w:pPr>
+            <w:r>
+              <w:t xml:space="preserve">Clear paid next step</w:t>
+            </w:r>
+          </w:p>
+        </w:tc>
+      </w:tr>
+    </w:tbl>
+    <w:p>
+      <w:pPr>
+        <w:pStyle w:val="Kicker"/>
+      </w:pPr>
+      <w:r>
+        <w:t xml:space="preserve">In this document</w:t>
+      </w:r>
+    </w:p>
+    <w:tbl>
+      <w:tblPr>
+        <w:tblW w:w="0" w:type="auto"/>
+        <w:tblInd w:w="0" w:type="dxa"/>
+        <w:tblBorders>
+          <w:top w:val="single" w:sz="6" w:color="E0DFDD"/>
+          <w:left w:val="single" w:sz="6" w:color="E0DFDD"/>
+          <w:bottom w:val="single" w:sz="6" w:color="E0DFDD"/>
+          <w:right w:val="single" w:sz="6" w:color="E0DFDD"/>
+          <w:insideH w:val="single" w:sz="4" w:color="E0DFDD"/>
+          <w:insideV w:val="single" w:sz="4" w:color="E0DFDD"/>
+        </w:tblBorders>
+        <w:tblLook w:firstRow="1" w:noHBand="0" w:noVBand="1"/>
+      </w:tblPr>
+      <w:tblGrid>
+        <w:gridCol w:w="1180"/>
+        <w:gridCol w:w="7940"/>
+      </w:tblGrid>
+      <w:tr>
+        <w:tc>
+          <w:tcPr>
+            <w:tcW w:w="1180" w:type="dxa"/>
+            <w:shd w:fill="0A0A0A"/>
+            <w:tcMar>
+              <w:top w:w="120" w:type="dxa"/>
+              <w:left w:w="150" w:type="dxa"/>
+              <w:bottom w:w="120" w:type="dxa"/>
+              <w:right w:w="150" w:type="dxa"/>
+            </w:tcMar>
+            <w:vAlign w:val="center"/>
+          </w:tcPr>
+          <w:p>
+            <w:pPr>
+              <w:pStyle w:val="TableHeader"/>
+            </w:pPr>
+            <w:r>
+              <w:t xml:space="preserve">Section</w:t>
+            </w:r>
+          </w:p>
+        </w:tc>
+        <w:tc>
+          <w:tcPr>
+            <w:tcW w:w="7940" w:type="dxa"/>
+            <w:shd w:fill="0A0A0A"/>
+            <w:tcMar>
+              <w:top w:w="120" w:type="dxa"/>
+              <w:left w:w="150" w:type="dxa"/>
+              <w:bottom w:w="120" w:type="dxa"/>
+              <w:right w:w="150" w:type="dxa"/>
+            </w:tcMar>
+            <w:vAlign w:val="center"/>
+          </w:tcPr>
+          <w:p>
+            <w:pPr>
+              <w:pStyle w:val="TableHeader"/>
+            </w:pPr>
+            <w:r>
+              <w:t xml:space="preserve">What it covers</w:t>
+            </w:r>
+          </w:p>
+        </w:tc>
+      </w:tr>
+      <w:tr>
+        <w:tc>
+          <w:tcPr>
+            <w:tcW w:w="1180" w:type="dxa"/>
+            <w:shd w:fill="F5F3F1"/>
+            <w:tcMar>
+              <w:top w:w="120" w:type="dxa"/>
+              <w:left w:w="150" w:type="dxa"/>
+              <w:bottom w:w="120" w:type="dxa"/>
+              <w:right w:w="150" w:type="dxa"/>
+            </w:tcMar>
+            <w:vAlign w:val="center"/>
+          </w:tcPr>
+          <w:p>
+            <w:pPr>
+              <w:pStyle w:val="TableCell"/>
+            </w:pPr>
+            <w:r>
+              <w:t xml:space="preserve">01</w:t>
+            </w:r>
+          </w:p>
+        </w:tc>
+        <w:tc>
+          <w:tcPr>
+            <w:tcW w:w="7940" w:type="dxa"/>
+            <w:shd w:fill="F5F3F1"/>
+            <w:tcMar>
+              <w:top w:w="120" w:type="dxa"/>
+              <w:left w:w="150" w:type="dxa"/>
+              <w:bottom w:w="120" w:type="dxa"/>
+              <w:right w:w="150" w:type="dxa"/>
+            </w:tcMar>
+            <w:vAlign w:val="center"/>
+          </w:tcPr>
+          <w:p>
+            <w:pPr>
+              <w:pStyle w:val="TableCell"/>
+            </w:pPr>
+            <w:r>
+              <w:t xml:space="preserve">Offer definition — Niche: [buyer segment].</w:t>
+            </w:r>
+          </w:p>
+        </w:tc>
+      </w:tr>
+      <w:tr>
+        <w:tc>
+          <w:tcPr>
+            <w:tcW w:w="1180" w:type="dxa"/>
+            <w:tcMar>
+              <w:top w:w="120" w:type="dxa"/>
+              <w:left w:w="150" w:type="dxa"/>
+              <w:bottom w:w="120" w:type="dxa"/>
+              <w:right w:w="150" w:type="dxa"/>
+            </w:tcMar>
+            <w:vAlign w:val="center"/>
+          </w:tcPr>
+          <w:p>
+            <w:pPr>
+              <w:pStyle w:val="TableCell"/>
+            </w:pPr>
+            <w:r>
+              <w:t xml:space="preserve">02</w:t>
+            </w:r>
+          </w:p>
+        </w:tc>
+        <w:tc>
+          <w:tcPr>
+            <w:tcW w:w="7940" w:type="dxa"/>
+            <w:tcMar>
+              <w:top w:w="120" w:type="dxa"/>
+              <w:left w:w="150" w:type="dxa"/>
+              <w:bottom w:w="120" w:type="dxa"/>
+              <w:right w:w="150" w:type="dxa"/>
+            </w:tcMar>
+            <w:vAlign w:val="center"/>
+          </w:tcPr>
+          <w:p>
+            <w:pPr>
+              <w:pStyle w:val="TableCell"/>
+            </w:pPr>
+            <w:r>
+              <w:t xml:space="preserve">Manual SOP — Receive input and confirm completeness.</w:t>
+            </w:r>
+          </w:p>
+        </w:tc>
+      </w:tr>
+      <w:tr>
+        <w:tc>
+          <w:tcPr>
+            <w:tcW w:w="1180" w:type="dxa"/>
+            <w:shd w:fill="F5F3F1"/>
+            <w:tcMar>
+              <w:top w:w="120" w:type="dxa"/>
+              <w:left w:w="150" w:type="dxa"/>
+              <w:bottom w:w="120" w:type="dxa"/>
+              <w:right w:w="150" w:type="dxa"/>
+            </w:tcMar>
+            <w:vAlign w:val="center"/>
+          </w:tcPr>
+          <w:p>
+            <w:pPr>
+              <w:pStyle w:val="TableCell"/>
+            </w:pPr>
+            <w:r>
+              <w:t xml:space="preserve">03</w:t>
+            </w:r>
+          </w:p>
+        </w:tc>
+        <w:tc>
+          <w:tcPr>
+            <w:tcW w:w="7940" w:type="dxa"/>
+            <w:shd w:fill="F5F3F1"/>
+            <w:tcMar>
+              <w:top w:w="120" w:type="dxa"/>
+              <w:left w:w="150" w:type="dxa"/>
+              <w:bottom w:w="120" w:type="dxa"/>
+              <w:right w:w="150" w:type="dxa"/>
+            </w:tcMar>
+            <w:vAlign w:val="center"/>
+          </w:tcPr>
+          <w:p>
+            <w:pPr>
+              <w:pStyle w:val="TableCell"/>
+            </w:pPr>
+            <w:r>
+              <w:t xml:space="preserve">QA checklist — Output matches the buyer's actual workflow.</w:t>
+            </w:r>
+          </w:p>
+        </w:tc>
+      </w:tr>
+      <w:tr>
+        <w:tc>
+          <w:tcPr>
+            <w:tcW w:w="1180" w:type="dxa"/>
+            <w:tcMar>
+              <w:top w:w="120" w:type="dxa"/>
+              <w:left w:w="150" w:type="dxa"/>
+              <w:bottom w:w="120" w:type="dxa"/>
+              <w:right w:w="150" w:type="dxa"/>
+            </w:tcMar>
+            <w:vAlign w:val="center"/>
+          </w:tcPr>
+          <w:p>
+            <w:pPr>
+              <w:pStyle w:val="TableCell"/>
+            </w:pPr>
+            <w:r>
+              <w:t xml:space="preserve">04</w:t>
+            </w:r>
+          </w:p>
+        </w:tc>
+        <w:tc>
+          <w:tcPr>
+            <w:tcW w:w="7940" w:type="dxa"/>
+            <w:tcMar>
+              <w:top w:w="120" w:type="dxa"/>
+              <w:left w:w="150" w:type="dxa"/>
+              <w:bottom w:w="120" w:type="dxa"/>
+              <w:right w:w="150" w:type="dxa"/>
+            </w:tcMar>
+            <w:vAlign w:val="center"/>
+          </w:tcPr>
+          <w:p>
+            <w:pPr>
+              <w:pStyle w:val="TableCell"/>
+            </w:pPr>
+            <w:r>
+              <w:t xml:space="preserve">Automation backlog — Repeated low-risk task.</w:t>
+            </w:r>
+          </w:p>
+        </w:tc>
+      </w:tr>
+      <w:tr>
+        <w:tc>
+          <w:tcPr>
+            <w:tcW w:w="1180" w:type="dxa"/>
+            <w:shd w:fill="F5F3F1"/>
+            <w:tcMar>
+              <w:top w:w="120" w:type="dxa"/>
+              <w:left w:w="150" w:type="dxa"/>
+              <w:bottom w:w="120" w:type="dxa"/>
+              <w:right w:w="150" w:type="dxa"/>
+            </w:tcMar>
+            <w:vAlign w:val="center"/>
+          </w:tcPr>
+          <w:p>
+            <w:pPr>
+              <w:pStyle w:val="TableCell"/>
+            </w:pPr>
+            <w:r>
+              <w:t xml:space="preserve">05</w:t>
+            </w:r>
+          </w:p>
+        </w:tc>
+        <w:tc>
+          <w:tcPr>
+            <w:tcW w:w="7940" w:type="dxa"/>
+            <w:shd w:fill="F5F3F1"/>
+            <w:tcMar>
+              <w:top w:w="120" w:type="dxa"/>
+              <w:left w:w="150" w:type="dxa"/>
+              <w:bottom w:w="120" w:type="dxa"/>
+              <w:right w:w="150" w:type="dxa"/>
+            </w:tcMar>
+            <w:vAlign w:val="center"/>
+          </w:tcPr>
+          <w:p>
+            <w:pPr>
+              <w:pStyle w:val="TableCell"/>
+            </w:pPr>
+            <w:r>
+              <w:t xml:space="preserve">Client report — Volume handled this week.</w:t>
+            </w:r>
+          </w:p>
+        </w:tc>
+      </w:tr>
+      <w:tr>
+        <w:tc>
+          <w:tcPr>
+            <w:tcW w:w="1180" w:type="dxa"/>
+            <w:tcMar>
+              <w:top w:w="120" w:type="dxa"/>
+              <w:left w:w="150" w:type="dxa"/>
+              <w:bottom w:w="120" w:type="dxa"/>
+              <w:right w:w="150" w:type="dxa"/>
+            </w:tcMar>
+            <w:vAlign w:val="center"/>
+          </w:tcPr>
+          <w:p>
+            <w:pPr>
+              <w:pStyle w:val="TableCell"/>
+            </w:pPr>
+            <w:r>
+              <w:t xml:space="preserve">06</w:t>
+            </w:r>
+          </w:p>
+        </w:tc>
+        <w:tc>
+          <w:tcPr>
+            <w:tcW w:w="7940" w:type="dxa"/>
+            <w:tcMar>
+              <w:top w:w="120" w:type="dxa"/>
+              <w:left w:w="150" w:type="dxa"/>
+              <w:bottom w:w="120" w:type="dxa"/>
+              <w:right w:w="150" w:type="dxa"/>
+            </w:tcMar>
+            <w:vAlign w:val="center"/>
+          </w:tcPr>
+          <w:p>
+            <w:pPr>
+              <w:pStyle w:val="TableCell"/>
+            </w:pPr>
+            <w:r>
+              <w:t xml:space="preserve">Filled example: weekly vendor research workflow — Niche: boutique agencies that need a weekly list of new vendor signals.</w:t>
+            </w:r>
+          </w:p>
+        </w:tc>
+      </w:tr>
+      <w:tr>
+        <w:tc>
+          <w:tcPr>
+            <w:tcW w:w="1180" w:type="dxa"/>
+            <w:shd w:fill="F5F3F1"/>
+            <w:tcMar>
+              <w:top w:w="120" w:type="dxa"/>
+              <w:left w:w="150" w:type="dxa"/>
+              <w:bottom w:w="120" w:type="dxa"/>
+              <w:right w:w="150" w:type="dxa"/>
+            </w:tcMar>
+            <w:vAlign w:val="center"/>
+          </w:tcPr>
+          <w:p>
+            <w:pPr>
+              <w:pStyle w:val="TableCell"/>
+            </w:pPr>
+            <w:r>
+              <w:t xml:space="preserve">07</w:t>
+            </w:r>
+          </w:p>
+        </w:tc>
+        <w:tc>
+          <w:tcPr>
+            <w:tcW w:w="7940" w:type="dxa"/>
+            <w:shd w:fill="F5F3F1"/>
+            <w:tcMar>
+              <w:top w:w="120" w:type="dxa"/>
+              <w:left w:w="150" w:type="dxa"/>
+              <w:bottom w:w="120" w:type="dxa"/>
+              <w:right w:w="150" w:type="dxa"/>
+            </w:tcMar>
+            <w:vAlign w:val="center"/>
+          </w:tcPr>
+          <w:p>
+            <w:pPr>
+              <w:pStyle w:val="TableCell"/>
+            </w:pPr>
+            <w:r>
+              <w:t xml:space="preserve">Pricing and handoff — Pilot: one weekly delivery for a fixed fee.</w:t>
+            </w:r>
+          </w:p>
+        </w:tc>
+      </w:tr>
+      <w:tr>
+        <w:tc>
+          <w:tcPr>
+            <w:tcW w:w="1180" w:type="dxa"/>
+            <w:tcMar>
+              <w:top w:w="120" w:type="dxa"/>
+              <w:left w:w="150" w:type="dxa"/>
+              <w:bottom w:w="120" w:type="dxa"/>
+              <w:right w:w="150" w:type="dxa"/>
+            </w:tcMar>
+            <w:vAlign w:val="center"/>
+          </w:tcPr>
+          <w:p>
+            <w:pPr>
+              <w:pStyle w:val="TableCell"/>
+            </w:pPr>
+            <w:r>
+              <w:t xml:space="preserve">08</w:t>
+            </w:r>
+          </w:p>
+        </w:tc>
+        <w:tc>
+          <w:tcPr>
+            <w:tcW w:w="7940" w:type="dxa"/>
+            <w:tcMar>
+              <w:top w:w="120" w:type="dxa"/>
+              <w:left w:w="150" w:type="dxa"/>
+              <w:bottom w:w="120" w:type="dxa"/>
+              <w:right w:w="150" w:type="dxa"/>
+            </w:tcMar>
+            <w:vAlign w:val="center"/>
+          </w:tcPr>
+          <w:p>
+            <w:pPr>
+              <w:pStyle w:val="TableCell"/>
+            </w:pPr>
+            <w:r>
+              <w:t xml:space="preserve">Operator dashboard fields — Requests received, requests completed, exceptions, manual minutes, approval delays, and…</w:t>
+            </w:r>
+          </w:p>
+        </w:tc>
+      </w:tr>
+      <w:tr>
+        <w:tc>
+          <w:tcPr>
+            <w:tcW w:w="1180" w:type="dxa"/>
+            <w:shd w:fill="F5F3F1"/>
+            <w:tcMar>
+              <w:top w:w="120" w:type="dxa"/>
+              <w:left w:w="150" w:type="dxa"/>
+              <w:bottom w:w="120" w:type="dxa"/>
+              <w:right w:w="150" w:type="dxa"/>
+            </w:tcMar>
+            <w:vAlign w:val="center"/>
+          </w:tcPr>
+          <w:p>
+            <w:pPr>
+              <w:pStyle w:val="TableCell"/>
+            </w:pPr>
+            <w:r>
+              <w:t xml:space="preserve">09</w:t>
+            </w:r>
+          </w:p>
+        </w:tc>
+        <w:tc>
+          <w:tcPr>
+            <w:tcW w:w="7940" w:type="dxa"/>
+            <w:shd w:fill="F5F3F1"/>
+            <w:tcMar>
+              <w:top w:w="120" w:type="dxa"/>
+              <w:left w:w="150" w:type="dxa"/>
+              <w:bottom w:w="120" w:type="dxa"/>
+              <w:right w:w="150" w:type="dxa"/>
+            </w:tcMar>
+            <w:vAlign w:val="center"/>
+          </w:tcPr>
+          <w:p>
+            <w:pPr>
+              <w:pStyle w:val="TableCell"/>
+            </w:pPr>
+            <w:r>
+              <w:t xml:space="preserve">Delivery standards (shared) — This asset is for niche b2b operators; replace bracketed fields with their specifics before…</w:t>
+            </w:r>
+          </w:p>
+        </w:tc>
+      </w:tr>
+    </w:tbl>
     <w:p>
       <w:pPr>
         <w:pStyle w:val="Heading3"/>
@@ -130,7 +1122,7 @@
         <w:pStyle w:val="Checklist"/>
       </w:pPr>
       <w:r>
-        <w:t xml:space="preserve">☐  Replace bracketed fields.</w:t>
+        <w:t xml:space="preserve">[ ]  Replace bracketed fields.</w:t>
       </w:r>
     </w:p>
     <w:p>
@@ -138,7 +1130,7 @@
         <w:pStyle w:val="Checklist"/>
       </w:pPr>
       <w:r>
-        <w:t xml:space="preserve">☐  Verify facts and claims.</w:t>
+        <w:t xml:space="preserve">[ ]  Verify facts and claims.</w:t>
       </w:r>
     </w:p>
     <w:p>
@@ -146,12 +1138,7 @@
         <w:pStyle w:val="Checklist"/>
       </w:pPr>
       <w:r>
-        <w:t xml:space="preserve">☐  Send for approval before publishing.</w:t>
-      </w:r>
-    </w:p>
-    <w:p>
-      <w:r>
-        <w:br w:type="page"/>
+        <w:t xml:space="preserve">[ ]  Send for approval before publishing.</w:t>
       </w:r>
     </w:p>
     <w:p>
@@ -162,66 +1149,287 @@
         <w:t xml:space="preserve">01 / Offer definition</w:t>
       </w:r>
     </w:p>
-    <w:p>
-      <w:pPr>
-        <w:pStyle w:val="ListParagraph"/>
-        <w:numPr>
-          <w:ilvl w:val="0"/>
-          <w:numId w:val="1"/>
-        </w:numPr>
-      </w:pPr>
-      <w:r>
-        <w:t xml:space="preserve">Niche: [buyer segment].</w:t>
-      </w:r>
-    </w:p>
-    <w:p>
-      <w:pPr>
-        <w:pStyle w:val="ListParagraph"/>
-        <w:numPr>
-          <w:ilvl w:val="0"/>
-          <w:numId w:val="1"/>
-        </w:numPr>
-      </w:pPr>
-      <w:r>
-        <w:t xml:space="preserve">Weekly outcome: [specific thing delivered].</w:t>
-      </w:r>
-    </w:p>
-    <w:p>
-      <w:pPr>
-        <w:pStyle w:val="ListParagraph"/>
-        <w:numPr>
-          <w:ilvl w:val="0"/>
-          <w:numId w:val="1"/>
-        </w:numPr>
-      </w:pPr>
-      <w:r>
-        <w:t xml:space="preserve">Input required: [files, access, approvals, decision rules].</w:t>
-      </w:r>
-    </w:p>
-    <w:p>
-      <w:pPr>
-        <w:pStyle w:val="ListParagraph"/>
-        <w:numPr>
-          <w:ilvl w:val="0"/>
-          <w:numId w:val="1"/>
-        </w:numPr>
-      </w:pPr>
-      <w:r>
-        <w:t xml:space="preserve">Delivery promise: [frequency, format, response window].</w:t>
-      </w:r>
-    </w:p>
-    <w:p>
-      <w:pPr>
-        <w:pStyle w:val="ListParagraph"/>
-        <w:numPr>
-          <w:ilvl w:val="0"/>
-          <w:numId w:val="1"/>
-        </w:numPr>
-      </w:pPr>
-      <w:r>
-        <w:t xml:space="preserve">Out of scope: [custom work, emergency work, unsupported channels].</w:t>
-      </w:r>
-    </w:p>
+    <w:tbl>
+      <w:tblPr>
+        <w:tblW w:w="0" w:type="auto"/>
+        <w:tblInd w:w="0" w:type="dxa"/>
+        <w:tblBorders>
+          <w:top w:val="single" w:sz="6" w:color="E0DFDD"/>
+          <w:left w:val="single" w:sz="6" w:color="E0DFDD"/>
+          <w:bottom w:val="single" w:sz="6" w:color="E0DFDD"/>
+          <w:right w:val="single" w:sz="6" w:color="E0DFDD"/>
+          <w:insideH w:val="single" w:sz="4" w:color="E0DFDD"/>
+          <w:insideV w:val="single" w:sz="4" w:color="E0DFDD"/>
+        </w:tblBorders>
+        <w:tblLook w:firstRow="1" w:noHBand="0" w:noVBand="1"/>
+      </w:tblPr>
+      <w:tblGrid>
+        <w:gridCol w:w="3000"/>
+        <w:gridCol w:w="6180"/>
+      </w:tblGrid>
+      <w:tr>
+        <w:tc>
+          <w:tcPr>
+            <w:tcW w:w="3000" w:type="dxa"/>
+            <w:shd w:fill="0A0A0A"/>
+            <w:tcMar>
+              <w:top w:w="120" w:type="dxa"/>
+              <w:left w:w="150" w:type="dxa"/>
+              <w:bottom w:w="120" w:type="dxa"/>
+              <w:right w:w="150" w:type="dxa"/>
+            </w:tcMar>
+            <w:vAlign w:val="center"/>
+          </w:tcPr>
+          <w:p>
+            <w:pPr>
+              <w:pStyle w:val="TableHeader"/>
+            </w:pPr>
+            <w:r>
+              <w:t xml:space="preserve">Field</w:t>
+            </w:r>
+          </w:p>
+        </w:tc>
+        <w:tc>
+          <w:tcPr>
+            <w:tcW w:w="6180" w:type="dxa"/>
+            <w:shd w:fill="0A0A0A"/>
+            <w:tcMar>
+              <w:top w:w="120" w:type="dxa"/>
+              <w:left w:w="150" w:type="dxa"/>
+              <w:bottom w:w="120" w:type="dxa"/>
+              <w:right w:w="150" w:type="dxa"/>
+            </w:tcMar>
+            <w:vAlign w:val="center"/>
+          </w:tcPr>
+          <w:p>
+            <w:pPr>
+              <w:pStyle w:val="TableHeader"/>
+            </w:pPr>
+            <w:r>
+              <w:t xml:space="preserve">Detail</w:t>
+            </w:r>
+          </w:p>
+        </w:tc>
+      </w:tr>
+      <w:tr>
+        <w:tc>
+          <w:tcPr>
+            <w:tcW w:w="3000" w:type="dxa"/>
+            <w:shd w:fill="F5F3F1"/>
+            <w:tcMar>
+              <w:top w:w="120" w:type="dxa"/>
+              <w:left w:w="150" w:type="dxa"/>
+              <w:bottom w:w="120" w:type="dxa"/>
+              <w:right w:w="150" w:type="dxa"/>
+            </w:tcMar>
+            <w:vAlign w:val="center"/>
+          </w:tcPr>
+          <w:p>
+            <w:pPr>
+              <w:pStyle w:val="TableLabel"/>
+            </w:pPr>
+            <w:r>
+              <w:t xml:space="preserve">Niche</w:t>
+            </w:r>
+          </w:p>
+        </w:tc>
+        <w:tc>
+          <w:tcPr>
+            <w:tcW w:w="6180" w:type="dxa"/>
+            <w:shd w:fill="F5F3F1"/>
+            <w:tcMar>
+              <w:top w:w="120" w:type="dxa"/>
+              <w:left w:w="150" w:type="dxa"/>
+              <w:bottom w:w="120" w:type="dxa"/>
+              <w:right w:w="150" w:type="dxa"/>
+            </w:tcMar>
+            <w:vAlign w:val="center"/>
+          </w:tcPr>
+          <w:p>
+            <w:pPr>
+              <w:pStyle w:val="TableCell"/>
+            </w:pPr>
+            <w:r>
+              <w:t xml:space="preserve">[buyer segment].</w:t>
+            </w:r>
+          </w:p>
+        </w:tc>
+      </w:tr>
+      <w:tr>
+        <w:tc>
+          <w:tcPr>
+            <w:tcW w:w="3000" w:type="dxa"/>
+            <w:shd w:fill="F5F3F1"/>
+            <w:tcMar>
+              <w:top w:w="120" w:type="dxa"/>
+              <w:left w:w="150" w:type="dxa"/>
+              <w:bottom w:w="120" w:type="dxa"/>
+              <w:right w:w="150" w:type="dxa"/>
+            </w:tcMar>
+            <w:vAlign w:val="center"/>
+          </w:tcPr>
+          <w:p>
+            <w:pPr>
+              <w:pStyle w:val="TableLabel"/>
+            </w:pPr>
+            <w:r>
+              <w:t xml:space="preserve">Weekly outcome</w:t>
+            </w:r>
+          </w:p>
+        </w:tc>
+        <w:tc>
+          <w:tcPr>
+            <w:tcW w:w="6180" w:type="dxa"/>
+            <w:tcMar>
+              <w:top w:w="120" w:type="dxa"/>
+              <w:left w:w="150" w:type="dxa"/>
+              <w:bottom w:w="120" w:type="dxa"/>
+              <w:right w:w="150" w:type="dxa"/>
+            </w:tcMar>
+            <w:vAlign w:val="center"/>
+          </w:tcPr>
+          <w:p>
+            <w:pPr>
+              <w:pStyle w:val="TableCell"/>
+            </w:pPr>
+            <w:r>
+              <w:t xml:space="preserve">[specific thing delivered].</w:t>
+            </w:r>
+          </w:p>
+        </w:tc>
+      </w:tr>
+      <w:tr>
+        <w:tc>
+          <w:tcPr>
+            <w:tcW w:w="3000" w:type="dxa"/>
+            <w:shd w:fill="F5F3F1"/>
+            <w:tcMar>
+              <w:top w:w="120" w:type="dxa"/>
+              <w:left w:w="150" w:type="dxa"/>
+              <w:bottom w:w="120" w:type="dxa"/>
+              <w:right w:w="150" w:type="dxa"/>
+            </w:tcMar>
+            <w:vAlign w:val="center"/>
+          </w:tcPr>
+          <w:p>
+            <w:pPr>
+              <w:pStyle w:val="TableLabel"/>
+            </w:pPr>
+            <w:r>
+              <w:t xml:space="preserve">Input required</w:t>
+            </w:r>
+          </w:p>
+        </w:tc>
+        <w:tc>
+          <w:tcPr>
+            <w:tcW w:w="6180" w:type="dxa"/>
+            <w:shd w:fill="F5F3F1"/>
+            <w:tcMar>
+              <w:top w:w="120" w:type="dxa"/>
+              <w:left w:w="150" w:type="dxa"/>
+              <w:bottom w:w="120" w:type="dxa"/>
+              <w:right w:w="150" w:type="dxa"/>
+            </w:tcMar>
+            <w:vAlign w:val="center"/>
+          </w:tcPr>
+          <w:p>
+            <w:pPr>
+              <w:pStyle w:val="TableCell"/>
+            </w:pPr>
+            <w:r>
+              <w:t xml:space="preserve">[files, access, approvals, decision rules].</w:t>
+            </w:r>
+          </w:p>
+        </w:tc>
+      </w:tr>
+      <w:tr>
+        <w:tc>
+          <w:tcPr>
+            <w:tcW w:w="3000" w:type="dxa"/>
+            <w:shd w:fill="F5F3F1"/>
+            <w:tcMar>
+              <w:top w:w="120" w:type="dxa"/>
+              <w:left w:w="150" w:type="dxa"/>
+              <w:bottom w:w="120" w:type="dxa"/>
+              <w:right w:w="150" w:type="dxa"/>
+            </w:tcMar>
+            <w:vAlign w:val="center"/>
+          </w:tcPr>
+          <w:p>
+            <w:pPr>
+              <w:pStyle w:val="TableLabel"/>
+            </w:pPr>
+            <w:r>
+              <w:t xml:space="preserve">Delivery promise</w:t>
+            </w:r>
+          </w:p>
+        </w:tc>
+        <w:tc>
+          <w:tcPr>
+            <w:tcW w:w="6180" w:type="dxa"/>
+            <w:tcMar>
+              <w:top w:w="120" w:type="dxa"/>
+              <w:left w:w="150" w:type="dxa"/>
+              <w:bottom w:w="120" w:type="dxa"/>
+              <w:right w:w="150" w:type="dxa"/>
+            </w:tcMar>
+            <w:vAlign w:val="center"/>
+          </w:tcPr>
+          <w:p>
+            <w:pPr>
+              <w:pStyle w:val="TableCell"/>
+            </w:pPr>
+            <w:r>
+              <w:t xml:space="preserve">[frequency, format, response window].</w:t>
+            </w:r>
+          </w:p>
+        </w:tc>
+      </w:tr>
+      <w:tr>
+        <w:tc>
+          <w:tcPr>
+            <w:tcW w:w="3000" w:type="dxa"/>
+            <w:shd w:fill="F5F3F1"/>
+            <w:tcMar>
+              <w:top w:w="120" w:type="dxa"/>
+              <w:left w:w="150" w:type="dxa"/>
+              <w:bottom w:w="120" w:type="dxa"/>
+              <w:right w:w="150" w:type="dxa"/>
+            </w:tcMar>
+            <w:vAlign w:val="center"/>
+          </w:tcPr>
+          <w:p>
+            <w:pPr>
+              <w:pStyle w:val="TableLabel"/>
+            </w:pPr>
+            <w:r>
+              <w:t xml:space="preserve">Out of scope</w:t>
+            </w:r>
+          </w:p>
+        </w:tc>
+        <w:tc>
+          <w:tcPr>
+            <w:tcW w:w="6180" w:type="dxa"/>
+            <w:shd w:fill="F5F3F1"/>
+            <w:tcMar>
+              <w:top w:w="120" w:type="dxa"/>
+              <w:left w:w="150" w:type="dxa"/>
+              <w:bottom w:w="120" w:type="dxa"/>
+              <w:right w:w="150" w:type="dxa"/>
+            </w:tcMar>
+            <w:vAlign w:val="center"/>
+          </w:tcPr>
+          <w:p>
+            <w:pPr>
+              <w:pStyle w:val="TableCell"/>
+            </w:pPr>
+            <w:r>
+              <w:t xml:space="preserve">[custom work, emergency work, unsupported channels].</w:t>
+            </w:r>
+          </w:p>
+        </w:tc>
+      </w:tr>
+    </w:tbl>
     <w:p>
       <w:pPr>
         <w:pStyle w:val="Heading1"/>
@@ -516,11 +1724,7 @@
     </w:p>
     <w:p>
       <w:pPr>
-        <w:pStyle w:val="ListParagraph"/>
-        <w:numPr>
-          <w:ilvl w:val="0"/>
-          <w:numId w:val="1"/>
-        </w:numPr>
+        <w:pStyle w:val="ExampleBlock"/>
       </w:pPr>
       <w:r>
         <w:t xml:space="preserve">Niche: boutique agencies that need a weekly list of new vendor signals.</w:t>
@@ -528,11 +1732,7 @@
     </w:p>
     <w:p>
       <w:pPr>
-        <w:pStyle w:val="ListParagraph"/>
-        <w:numPr>
-          <w:ilvl w:val="0"/>
-          <w:numId w:val="1"/>
-        </w:numPr>
+        <w:pStyle w:val="ExampleBlock"/>
       </w:pPr>
       <w:r>
         <w:t xml:space="preserve">Weekly outcome: a ranked list of 20 properties with owner, likely motivation signal, source link, and suggested opener.</w:t>
@@ -540,11 +1740,7 @@
     </w:p>
     <w:p>
       <w:pPr>
-        <w:pStyle w:val="ListParagraph"/>
-        <w:numPr>
-          <w:ilvl w:val="0"/>
-          <w:numId w:val="1"/>
-        </w:numPr>
+        <w:pStyle w:val="ExampleBlock"/>
       </w:pPr>
       <w:r>
         <w:t xml:space="preserve">Input: target suburbs, excluded property types, agency tone rules, CRM import format.</w:t>
@@ -552,11 +1748,7 @@
     </w:p>
     <w:p>
       <w:pPr>
-        <w:pStyle w:val="ListParagraph"/>
-        <w:numPr>
-          <w:ilvl w:val="0"/>
-          <w:numId w:val="1"/>
-        </w:numPr>
+        <w:pStyle w:val="ExampleBlock"/>
       </w:pPr>
       <w:r>
         <w:t xml:space="preserve">Delivery promise: every Monday by 9am as CSV plus 5 recommended first calls.</w:t>
@@ -570,42 +1762,200 @@
         <w:t xml:space="preserve">07 / Pricing and handoff</w:t>
       </w:r>
     </w:p>
-    <w:p>
-      <w:pPr>
-        <w:pStyle w:val="ListParagraph"/>
-        <w:numPr>
-          <w:ilvl w:val="0"/>
-          <w:numId w:val="1"/>
-        </w:numPr>
-      </w:pPr>
-      <w:r>
-        <w:t xml:space="preserve">Pilot: one weekly delivery for a fixed fee.</w:t>
-      </w:r>
-    </w:p>
-    <w:p>
-      <w:pPr>
-        <w:pStyle w:val="ListParagraph"/>
-        <w:numPr>
-          <w:ilvl w:val="0"/>
-          <w:numId w:val="1"/>
-        </w:numPr>
-      </w:pPr>
-      <w:r>
-        <w:t xml:space="preserve">Retainer: four weekly deliveries plus one refinement call.</w:t>
-      </w:r>
-    </w:p>
-    <w:p>
-      <w:pPr>
-        <w:pStyle w:val="ListParagraph"/>
-        <w:numPr>
-          <w:ilvl w:val="0"/>
-          <w:numId w:val="1"/>
-        </w:numPr>
-      </w:pPr>
-      <w:r>
-        <w:t xml:space="preserve">Automation review: after four deliveries, identify one repeated step to automate.</w:t>
-      </w:r>
-    </w:p>
+    <w:tbl>
+      <w:tblPr>
+        <w:tblW w:w="0" w:type="auto"/>
+        <w:tblInd w:w="0" w:type="dxa"/>
+        <w:tblBorders>
+          <w:top w:val="single" w:sz="6" w:color="E0DFDD"/>
+          <w:left w:val="single" w:sz="6" w:color="E0DFDD"/>
+          <w:bottom w:val="single" w:sz="6" w:color="E0DFDD"/>
+          <w:right w:val="single" w:sz="6" w:color="E0DFDD"/>
+          <w:insideH w:val="single" w:sz="4" w:color="E0DFDD"/>
+          <w:insideV w:val="single" w:sz="4" w:color="E0DFDD"/>
+        </w:tblBorders>
+        <w:tblLook w:firstRow="1" w:noHBand="0" w:noVBand="1"/>
+      </w:tblPr>
+      <w:tblGrid>
+        <w:gridCol w:w="3000"/>
+        <w:gridCol w:w="6180"/>
+      </w:tblGrid>
+      <w:tr>
+        <w:tc>
+          <w:tcPr>
+            <w:tcW w:w="3000" w:type="dxa"/>
+            <w:shd w:fill="0A0A0A"/>
+            <w:tcMar>
+              <w:top w:w="120" w:type="dxa"/>
+              <w:left w:w="150" w:type="dxa"/>
+              <w:bottom w:w="120" w:type="dxa"/>
+              <w:right w:w="150" w:type="dxa"/>
+            </w:tcMar>
+            <w:vAlign w:val="center"/>
+          </w:tcPr>
+          <w:p>
+            <w:pPr>
+              <w:pStyle w:val="TableHeader"/>
+            </w:pPr>
+            <w:r>
+              <w:t xml:space="preserve">Scope</w:t>
+            </w:r>
+          </w:p>
+        </w:tc>
+        <w:tc>
+          <w:tcPr>
+            <w:tcW w:w="6180" w:type="dxa"/>
+            <w:shd w:fill="0A0A0A"/>
+            <w:tcMar>
+              <w:top w:w="120" w:type="dxa"/>
+              <w:left w:w="150" w:type="dxa"/>
+              <w:bottom w:w="120" w:type="dxa"/>
+              <w:right w:w="150" w:type="dxa"/>
+            </w:tcMar>
+            <w:vAlign w:val="center"/>
+          </w:tcPr>
+          <w:p>
+            <w:pPr>
+              <w:pStyle w:val="TableHeader"/>
+            </w:pPr>
+            <w:r>
+              <w:t xml:space="preserve">What it includes</w:t>
+            </w:r>
+          </w:p>
+        </w:tc>
+      </w:tr>
+      <w:tr>
+        <w:tc>
+          <w:tcPr>
+            <w:tcW w:w="3000" w:type="dxa"/>
+            <w:shd w:fill="F5F3F1"/>
+            <w:tcMar>
+              <w:top w:w="120" w:type="dxa"/>
+              <w:left w:w="150" w:type="dxa"/>
+              <w:bottom w:w="120" w:type="dxa"/>
+              <w:right w:w="150" w:type="dxa"/>
+            </w:tcMar>
+            <w:vAlign w:val="center"/>
+          </w:tcPr>
+          <w:p>
+            <w:pPr>
+              <w:pStyle w:val="TableLabel"/>
+            </w:pPr>
+            <w:r>
+              <w:t xml:space="preserve">Pilot</w:t>
+            </w:r>
+          </w:p>
+        </w:tc>
+        <w:tc>
+          <w:tcPr>
+            <w:tcW w:w="6180" w:type="dxa"/>
+            <w:shd w:fill="F5F3F1"/>
+            <w:tcMar>
+              <w:top w:w="120" w:type="dxa"/>
+              <w:left w:w="150" w:type="dxa"/>
+              <w:bottom w:w="120" w:type="dxa"/>
+              <w:right w:w="150" w:type="dxa"/>
+            </w:tcMar>
+            <w:vAlign w:val="center"/>
+          </w:tcPr>
+          <w:p>
+            <w:pPr>
+              <w:pStyle w:val="TableCell"/>
+            </w:pPr>
+            <w:r>
+              <w:t xml:space="preserve">one weekly delivery for a fixed fee.</w:t>
+            </w:r>
+          </w:p>
+        </w:tc>
+      </w:tr>
+      <w:tr>
+        <w:tc>
+          <w:tcPr>
+            <w:tcW w:w="3000" w:type="dxa"/>
+            <w:shd w:fill="F5F3F1"/>
+            <w:tcMar>
+              <w:top w:w="120" w:type="dxa"/>
+              <w:left w:w="150" w:type="dxa"/>
+              <w:bottom w:w="120" w:type="dxa"/>
+              <w:right w:w="150" w:type="dxa"/>
+            </w:tcMar>
+            <w:vAlign w:val="center"/>
+          </w:tcPr>
+          <w:p>
+            <w:pPr>
+              <w:pStyle w:val="TableLabel"/>
+            </w:pPr>
+            <w:r>
+              <w:t xml:space="preserve">Retainer</w:t>
+            </w:r>
+          </w:p>
+        </w:tc>
+        <w:tc>
+          <w:tcPr>
+            <w:tcW w:w="6180" w:type="dxa"/>
+            <w:tcMar>
+              <w:top w:w="120" w:type="dxa"/>
+              <w:left w:w="150" w:type="dxa"/>
+              <w:bottom w:w="120" w:type="dxa"/>
+              <w:right w:w="150" w:type="dxa"/>
+            </w:tcMar>
+            <w:vAlign w:val="center"/>
+          </w:tcPr>
+          <w:p>
+            <w:pPr>
+              <w:pStyle w:val="TableCell"/>
+            </w:pPr>
+            <w:r>
+              <w:t xml:space="preserve">four weekly deliveries plus one refinement call.</w:t>
+            </w:r>
+          </w:p>
+        </w:tc>
+      </w:tr>
+      <w:tr>
+        <w:tc>
+          <w:tcPr>
+            <w:tcW w:w="3000" w:type="dxa"/>
+            <w:shd w:fill="F5F3F1"/>
+            <w:tcMar>
+              <w:top w:w="120" w:type="dxa"/>
+              <w:left w:w="150" w:type="dxa"/>
+              <w:bottom w:w="120" w:type="dxa"/>
+              <w:right w:w="150" w:type="dxa"/>
+            </w:tcMar>
+            <w:vAlign w:val="center"/>
+          </w:tcPr>
+          <w:p>
+            <w:pPr>
+              <w:pStyle w:val="TableLabel"/>
+            </w:pPr>
+            <w:r>
+              <w:t xml:space="preserve">Automation review</w:t>
+            </w:r>
+          </w:p>
+        </w:tc>
+        <w:tc>
+          <w:tcPr>
+            <w:tcW w:w="6180" w:type="dxa"/>
+            <w:shd w:fill="F5F3F1"/>
+            <w:tcMar>
+              <w:top w:w="120" w:type="dxa"/>
+              <w:left w:w="150" w:type="dxa"/>
+              <w:bottom w:w="120" w:type="dxa"/>
+              <w:right w:w="150" w:type="dxa"/>
+            </w:tcMar>
+            <w:vAlign w:val="center"/>
+          </w:tcPr>
+          <w:p>
+            <w:pPr>
+              <w:pStyle w:val="TableCell"/>
+            </w:pPr>
+            <w:r>
+              <w:t xml:space="preserve">after four deliveries, identify one repeated step to automate.</w:t>
+            </w:r>
+          </w:p>
+        </w:tc>
+      </w:tr>
+    </w:tbl>
     <w:p>
       <w:pPr>
         <w:pStyle w:val="Heading1"/>
@@ -722,7 +2072,7 @@
     <w:sectPr>
       <w:footerReference w:type="default" r:id="rId3"/>
       <w:pgSz w:w="12240" w:h="15840"/>
-      <w:pgMar w:top="1008" w:right="936" w:bottom="864" w:left="936" w:footer="432"/>
+      <w:pgMar w:top="1180" w:right="1440" w:bottom="1000" w:left="1440" w:footer="432"/>
       <w:cols w:space="720"/>
     </w:sectPr>
   </w:body>
@@ -744,7 +2094,21 @@
         <w:sz w:val="16"/>
         <w:color w:val="57534E"/>
       </w:rPr>
-      <w:t xml:space="preserve">Side Hustle Stephen - The Launchpad  /  Manual Workflow Concierge  /  Verify facts before client use</w:t>
+      <w:t xml:space="preserve">Side Hustle Stephen / Manual Workflow Concierge / Page </w:t>
+    </w:r>
+    <w:r>
+      <w:rPr>
+        <w:rFonts w:ascii="Arial" w:hAnsi="Arial"/>
+        <w:sz w:val="16"/>
+        <w:color w:val="57534E"/>
+      </w:rPr>
+      <w:fldChar w:fldCharType="begin"/>
+    </w:r>
+    <w:r>
+      <w:instrText xml:space="preserve"> PAGE </w:instrText>
+    </w:r>
+    <w:r>
+      <w:fldChar w:fldCharType="end"/>
     </w:r>
   </w:p>
 </w:ftr>
@@ -868,15 +2232,15 @@
     <w:rPr>
       <w:rFonts w:ascii="Arial" w:hAnsi="Arial"/>
       <w:b/>
-      <w:sz w:val="26"/>
+      <w:sz w:val="30"/>
       <w:color w:val="0A0A0A"/>
-      <w:spacing w:val="-4"/>
+      <w:spacing w:val="-6"/>
     </w:rPr>
     <w:pPr>
       <w:keepNext/>
-      <w:spacing w:before="340" w:after="130"/>
+      <w:spacing w:before="360" w:after="140"/>
       <w:pBdr>
-        <w:bottom w:val="single" w:sz="6" w:space="6" w:color="E0DFDD"/>
+        <w:bottom w:val="single" w:sz="12" w:space="7" w:color="0A0A0A"/>
       </w:pBdr>
     </w:pPr>
   </w:style>
@@ -885,11 +2249,11 @@
     <w:rPr>
       <w:rFonts w:ascii="Arial" w:hAnsi="Arial"/>
       <w:b/>
-      <w:sz w:val="23"/>
-      <w:color w:val="57534E"/>
+      <w:sz w:val="24"/>
+      <w:color w:val="0A0A0A"/>
     </w:rPr>
     <w:pPr>
-      <w:spacing w:after="60"/>
+      <w:spacing w:after="70"/>
     </w:pPr>
   </w:style>
   <w:style w:type="paragraph" w:styleId="Heading3">
@@ -897,11 +2261,12 @@
     <w:rPr>
       <w:rFonts w:ascii="Arial" w:hAnsi="Arial"/>
       <w:b/>
-      <w:sz w:val="20"/>
-      <w:color w:val="0A0A0A"/>
+      <w:sz w:val="22"/>
+      <w:color w:val="0A59D2"/>
     </w:rPr>
     <w:pPr>
-      <w:spacing w:before="150" w:after="80"/>
+      <w:keepNext/>
+      <w:spacing w:before="190" w:after="70"/>
     </w:pPr>
   </w:style>
   <w:style w:type="paragraph" w:styleId="Meta">
@@ -939,9 +2304,9 @@
     </w:rPr>
     <w:pPr>
       <w:spacing w:after="92" w:line="280" w:lineRule="auto"/>
-      <w:shd w:fill="F5F3F1"/>
+      <w:shd w:fill="EEF4FF"/>
       <w:pBdr>
-        <w:left w:val="single" w:sz="14" w:space="8" w:color="0A0A0A"/>
+        <w:left w:val="single" w:sz="18" w:space="8" w:color="0A59D2"/>
       </w:pBdr>
     </w:pPr>
   </w:style>
@@ -949,15 +2314,86 @@
     <w:name w:val="Intense Quote"/>
     <w:rPr>
       <w:rFonts w:ascii="Arial" w:hAnsi="Arial"/>
+      <w:b/>
       <w:color w:val="0A0A0A"/>
-      <w:sz w:val="20"/>
+      <w:sz w:val="21"/>
     </w:rPr>
     <w:pPr>
       <w:spacing w:before="90" w:after="170" w:line="292" w:lineRule="auto"/>
       <w:shd w:fill="F5F3F1"/>
       <w:pBdr>
-        <w:left w:val="single" w:sz="18" w:space="10" w:color="0A0A0A"/>
+        <w:left w:val="single" w:sz="24" w:space="10" w:color="0A0A0A"/>
       </w:pBdr>
+    </w:pPr>
+  </w:style>
+  <w:style w:type="paragraph" w:styleId="ExampleBlock">
+    <w:name w:val="Example Block"/>
+    <w:rPr>
+      <w:rFonts w:ascii="Arial" w:hAnsi="Arial"/>
+      <w:sz w:val="21"/>
+      <w:color w:val="0A0A0A"/>
+    </w:rPr>
+    <w:pPr>
+      <w:spacing w:before="60" w:after="120" w:line="288" w:lineRule="auto"/>
+      <w:shd w:fill="EEF4FF"/>
+      <w:pBdr>
+        <w:left w:val="single" w:sz="14" w:space="8" w:color="0A59D2"/>
+      </w:pBdr>
+    </w:pPr>
+  </w:style>
+  <w:style w:type="paragraph" w:styleId="EmailSubject">
+    <w:name w:val="Email Subject"/>
+    <w:rPr>
+      <w:rFonts w:ascii="Arial" w:hAnsi="Arial"/>
+      <w:b/>
+      <w:sz w:val="21"/>
+      <w:color w:val="0A0A0A"/>
+    </w:rPr>
+    <w:pPr>
+      <w:keepNext/>
+      <w:spacing w:before="150" w:after="0" w:line="284" w:lineRule="auto"/>
+      <w:shd w:fill="EEF4FF"/>
+      <w:pBdr>
+        <w:top w:val="single" w:sz="14" w:space="6" w:color="0A59D2"/>
+        <w:left w:val="single" w:sz="14" w:space="8" w:color="0A59D2"/>
+      </w:pBdr>
+    </w:pPr>
+  </w:style>
+  <w:style w:type="paragraph" w:styleId="TableHeader">
+    <w:name w:val="Table Header"/>
+    <w:rPr>
+      <w:rFonts w:ascii="Arial" w:hAnsi="Arial"/>
+      <w:b/>
+      <w:caps/>
+      <w:sz w:val="18"/>
+      <w:color w:val="FFFFFF"/>
+      <w:spacing w:val="14"/>
+    </w:rPr>
+    <w:pPr>
+      <w:spacing w:before="0" w:after="0" w:line="250" w:lineRule="auto"/>
+    </w:pPr>
+  </w:style>
+  <w:style w:type="paragraph" w:styleId="TableCell">
+    <w:name w:val="Table Cell"/>
+    <w:rPr>
+      <w:rFonts w:ascii="Arial" w:hAnsi="Arial"/>
+      <w:sz w:val="20"/>
+      <w:color w:val="0A0A0A"/>
+    </w:rPr>
+    <w:pPr>
+      <w:spacing w:before="0" w:after="0" w:line="262" w:lineRule="auto"/>
+    </w:pPr>
+  </w:style>
+  <w:style w:type="paragraph" w:styleId="TableLabel">
+    <w:name w:val="Table Label"/>
+    <w:rPr>
+      <w:rFonts w:ascii="Arial" w:hAnsi="Arial"/>
+      <w:b/>
+      <w:sz w:val="20"/>
+      <w:color w:val="0A0A0A"/>
+    </w:rPr>
+    <w:pPr>
+      <w:spacing w:before="0" w:after="0" w:line="262" w:lineRule="auto"/>
     </w:pPr>
   </w:style>
 </w:styles>

</xml_diff>